<commit_message>
Alinha a especificação aos enunciados da 1ª Sprint
- Três personas (Cliente, Lojista Parceiro, Administrador); o papel de
  curador passa ao Administrador. PBB v3 com os PBIs da 1ª Sprint.
- User stories no padrão da rubrica: persona no COMO, benefício da
  feature no PARA, CA1 fluxo principal e CA2 exceção.
- Artefato 6 recortado para a 1ª Sprint (17 tabelas) e script SQL
  MySQL 8 gerado da mesma fonte do DER, com carga inicial do
  questionário e consultas de verificação (testado em MySQL 8.4).
- Especificação v3 no template novo (orientadores), guia do Trello com
  etiquetas PBI/Sprint, responsáveis, datas, checklists e evolução.

Co-Authored-By: Claude Opus 5 (1M context) <noreply@anthropic.com>
</commit_message>
<xml_diff>
--- a/entregas/especificacao/Modular_Perfumes_Especificacao_do_Projeto.docx
+++ b/entregas/especificacao/Modular_Perfumes_Especificacao_do_Projeto.docx
@@ -276,16 +276,16 @@
                               <w:spacing w:after="0"/>
                             </w:pPr>
                             <w:r>
-                              <w:t>Prof</w:t>
+                              <w:t xml:space="preserve">Profa. Cristina Verçosa P. B. de Souza</w:t>
                             </w:r>
                             <w:r>
                               <w:rPr>
                                 <w:vertAlign w:val="superscript"/>
                               </w:rPr>
-                              <w:t>a</w:t>
+                              <w:t/>
                             </w:r>
                             <w:r>
-                              <w:t xml:space="preserve">. </w:t>
+                              <w:t xml:space="preserve"/>
                             </w:r>
                             <w:proofErr w:type="spellStart"/>
                             <w:r>
@@ -293,7 +293,7 @@
                                 <w:rFonts w:eastAsia="Arial" w:cs="Arial"/>
                                 <w:color w:val="000000" w:themeColor="text1"/>
                               </w:rPr>
-                              <w:t>Lisiane</w:t>
+                              <w:t/>
                             </w:r>
                             <w:proofErr w:type="spellEnd"/>
                             <w:r>
@@ -301,7 +301,7 @@
                                 <w:rFonts w:eastAsia="Arial" w:cs="Arial"/>
                                 <w:color w:val="000000" w:themeColor="text1"/>
                               </w:rPr>
-                              <w:t xml:space="preserve"> </w:t>
+                              <w:t xml:space="preserve"/>
                             </w:r>
                             <w:proofErr w:type="spellStart"/>
                             <w:r>
@@ -309,7 +309,7 @@
                                 <w:rFonts w:eastAsia="Arial" w:cs="Arial"/>
                                 <w:color w:val="000000" w:themeColor="text1"/>
                               </w:rPr>
-                              <w:t>Reips</w:t>
+                              <w:t/>
                             </w:r>
                             <w:proofErr w:type="spellEnd"/>
                           </w:p>
@@ -431,16 +431,16 @@
                         <w:spacing w:after="0"/>
                       </w:pPr>
                       <w:r>
-                        <w:t>Prof</w:t>
+                        <w:t xml:space="preserve">Profa. Cristina Verçosa P. B. de Souza</w:t>
                       </w:r>
                       <w:r>
                         <w:rPr>
                           <w:vertAlign w:val="superscript"/>
                         </w:rPr>
-                        <w:t>a</w:t>
+                        <w:t/>
                       </w:r>
                       <w:r>
-                        <w:t xml:space="preserve">. </w:t>
+                        <w:t xml:space="preserve"/>
                       </w:r>
                       <w:proofErr w:type="spellStart"/>
                       <w:r>
@@ -448,7 +448,7 @@
                           <w:rFonts w:eastAsia="Arial" w:cs="Arial"/>
                           <w:color w:val="000000" w:themeColor="text1"/>
                         </w:rPr>
-                        <w:t>Lisiane</w:t>
+                        <w:t/>
                       </w:r>
                       <w:proofErr w:type="spellEnd"/>
                       <w:r>
@@ -456,7 +456,7 @@
                           <w:rFonts w:eastAsia="Arial" w:cs="Arial"/>
                           <w:color w:val="000000" w:themeColor="text1"/>
                         </w:rPr>
-                        <w:t xml:space="preserve"> </w:t>
+                        <w:t xml:space="preserve"/>
                       </w:r>
                       <w:proofErr w:type="spellStart"/>
                       <w:r>
@@ -464,7 +464,7 @@
                           <w:rFonts w:eastAsia="Arial" w:cs="Arial"/>
                           <w:color w:val="000000" w:themeColor="text1"/>
                         </w:rPr>
-                        <w:t>Reips</w:t>
+                        <w:t/>
                       </w:r>
                       <w:proofErr w:type="spellEnd"/>
                     </w:p>
@@ -1865,7 +1865,7 @@
               </w:rPr>
             </w:pPr>
             <w:r>
-              <w:t xml:space="preserve">Reunir em um único lugar um catálogo completo e confiável — foto, notas olfativas e acordes de cada perfume —, importado de uma API externa e revisado por um curador olfativo.</w:t>
+              <w:t xml:space="preserve">Reunir em um único lugar um catálogo completo e confiável — foto, notas olfativas e acordes de cada perfume —, importado de uma API externa e revisado pelo administrador.</w:t>
             </w:r>
           </w:p>
         </w:tc>
@@ -2377,7 +2377,7 @@
                 <w:sz w:val="24"/>
                 <w:szCs w:val="24"/>
               </w:rPr>
-              <w:t xml:space="preserve">Permite ao curador manter o questionário, ao lojista manter suas ofertas e ao administrador importar o catálogo e gerenciar os usuários.</w:t>
+              <w:t xml:space="preserve">Permite ao administrador manter o questionário, importar o catálogo e aprovar lojas, e ao lojista manter suas ofertas.</w:t>
             </w:r>
           </w:p>
         </w:tc>
@@ -3595,7 +3595,7 @@
       <w:r>
         <w:drawing>
           <wp:inline xmlns:a="http://schemas.openxmlformats.org/drawingml/2006/main" xmlns:pic="http://schemas.openxmlformats.org/drawingml/2006/picture">
-            <wp:extent cx="5400040" cy="2777421"/>
+            <wp:extent cx="5400040" cy="2611819"/>
             <wp:docPr id="218" name="Picture 218"/>
             <wp:cNvGraphicFramePr>
               <a:graphicFrameLocks noChangeAspect="1"/>
@@ -3616,7 +3616,7 @@
                   <pic:spPr>
                     <a:xfrm>
                       <a:off x="0" y="0"/>
-                      <a:ext cx="5400040" cy="2777421"/>
+                      <a:ext cx="5400040" cy="2611819"/>
                     </a:xfrm>
                     <a:prstGeom prst="rect"/>
                   </pic:spPr>
@@ -3747,7 +3747,7 @@
                 <w:b/>
                 <w:bCs/>
               </w:rPr>
-              <w:t xml:space="preserve">COMO: visitante não cadastrado</w:t>
+              <w:t xml:space="preserve">COMO: Cliente</w:t>
             </w:r>
           </w:p>
           <w:p>
@@ -3760,7 +3760,7 @@
                 <w:b/>
                 <w:bCs/>
               </w:rPr>
-              <w:t xml:space="preserve">POSSO: criar minha conta informando nome, e-mail e senha.</w:t>
+              <w:t xml:space="preserve">POSSO: realizar o cadastro na plataforma, informando nome, e-mail e senha.</w:t>
             </w:r>
           </w:p>
           <w:p>
@@ -3773,7 +3773,7 @@
                 <w:b/>
                 <w:bCs/>
               </w:rPr>
-              <w:t xml:space="preserve">PARA: ter acesso gratuito ao consultor olfativo.</w:t>
+              <w:t xml:space="preserve">PARA: ter acesso grátis com login ao consultor olfativo.</w:t>
             </w:r>
           </w:p>
         </w:tc>
@@ -4118,7 +4118,7 @@
                 <w:b/>
                 <w:bCs/>
               </w:rPr>
-              <w:t xml:space="preserve">COMO: usuário cadastrado (cliente, curador, lojista ou administrador)</w:t>
+              <w:t xml:space="preserve">COMO: Cliente</w:t>
             </w:r>
           </w:p>
           <w:p>
@@ -4131,7 +4131,7 @@
                 <w:b/>
                 <w:bCs/>
               </w:rPr>
-              <w:t xml:space="preserve">POSSO: entrar na plataforma com e-mail e senha.</w:t>
+              <w:t xml:space="preserve">POSSO: realizar o login na plataforma com e-mail e senha.</w:t>
             </w:r>
           </w:p>
           <w:p>
@@ -4144,7 +4144,7 @@
                 <w:b/>
                 <w:bCs/>
               </w:rPr>
-              <w:t xml:space="preserve">PARA: acessar as funções do meu perfil de acesso.</w:t>
+              <w:t xml:space="preserve">PARA: acessar meu perfil olfativo salvo.</w:t>
             </w:r>
           </w:p>
         </w:tc>
@@ -4206,7 +4206,7 @@
                 <w:b/>
                 <w:bCs/>
               </w:rPr>
-              <w:t xml:space="preserve">DADO QUE: tenho uma conta ativa</w:t>
+              <w:t xml:space="preserve">DADO QUE: tenho uma conta ativa e já concluí o questionário de perfil</w:t>
             </w:r>
           </w:p>
           <w:p>
@@ -4238,7 +4238,7 @@
                 <w:b/>
                 <w:bCs/>
               </w:rPr>
-              <w:t xml:space="preserve">ENTÃO: o sistema abre a sessão e me leva à página inicial do meu perfil de acesso.</w:t>
+              <w:t xml:space="preserve">ENTÃO: o sistema abre a sessão e me leva à minha página inicial, com o meu perfil olfativo.</w:t>
             </w:r>
           </w:p>
         </w:tc>
@@ -4394,7 +4394,7 @@
                 <w:b/>
                 <w:bCs/>
               </w:rPr>
-              <w:t xml:space="preserve">DADO QUE: sou cliente e ainda não concluí o questionário de perfil</w:t>
+              <w:t xml:space="preserve">DADO QUE: ainda não concluí o questionário de perfil</w:t>
             </w:r>
           </w:p>
           <w:p>
@@ -4489,7 +4489,7 @@
                 <w:b/>
                 <w:bCs/>
               </w:rPr>
-              <w:t xml:space="preserve">COMO: cliente autenticado</w:t>
+              <w:t xml:space="preserve">COMO: Cliente</w:t>
             </w:r>
           </w:p>
           <w:p>
@@ -4515,7 +4515,7 @@
                 <w:b/>
                 <w:bCs/>
               </w:rPr>
-              <w:t xml:space="preserve">PARA: liberar o consultor de IA e receber recomendações que combinem comigo.</w:t>
+              <w:t xml:space="preserve">PARA: ter o meu perfil olfativo salvo e receber recomendações que combinem comigo.</w:t>
             </w:r>
           </w:p>
         </w:tc>
@@ -4860,7 +4860,7 @@
                 <w:b/>
                 <w:bCs/>
               </w:rPr>
-              <w:t xml:space="preserve">COMO: curador olfativo</w:t>
+              <w:t xml:space="preserve">COMO: Administrador</w:t>
             </w:r>
           </w:p>
           <w:p>
@@ -4886,7 +4886,7 @@
                 <w:b/>
                 <w:bCs/>
               </w:rPr>
-              <w:t xml:space="preserve">PARA: que o questionário revele bem o perfil olfativo de cada cliente.</w:t>
+              <w:t xml:space="preserve">PARA: ter perguntas editáveis que revelem o perfil olfativo de cada cliente.</w:t>
             </w:r>
           </w:p>
         </w:tc>
@@ -4980,7 +4980,7 @@
                 <w:b/>
                 <w:bCs/>
               </w:rPr>
-              <w:t xml:space="preserve">ENTÃO: o sistema grava a pergunta como ativa e a exibe na lista, na ordem definida.</w:t>
+              <w:t xml:space="preserve">ENTÃO: o sistema grava a pergunta como ativa e a exibe na lista, na ordem definida, com as opções "Alterar" e "Excluir".</w:t>
             </w:r>
           </w:p>
         </w:tc>
@@ -5042,7 +5042,7 @@
                 <w:b/>
                 <w:bCs/>
               </w:rPr>
-              <w:t xml:space="preserve">DADO QUE: existe uma pergunta cadastrada</w:t>
+              <w:t xml:space="preserve">DADO QUE: estou cadastrando ou alterando uma pergunta</w:t>
             </w:r>
           </w:p>
           <w:p>
@@ -5058,7 +5058,7 @@
                 <w:b/>
                 <w:bCs/>
               </w:rPr>
-              <w:t xml:space="preserve">QUANDO: altero o enunciado ou as alternativas e aciono "Salvar"</w:t>
+              <w:t xml:space="preserve">QUANDO: deixo o enunciado vazio ou informo menos de duas alternativas e aciono "Salvar"</w:t>
             </w:r>
           </w:p>
           <w:p>
@@ -5074,7 +5074,7 @@
                 <w:b/>
                 <w:bCs/>
               </w:rPr>
-              <w:t xml:space="preserve">ENTÃO: o sistema grava a alteração e os próximos clientes passam a ver a versão nova.</w:t>
+              <w:t xml:space="preserve">ENTÃO: o sistema não grava a pergunta e exibe "Informe o enunciado e pelo menos duas alternativas".</w:t>
             </w:r>
           </w:p>
         </w:tc>
@@ -5231,7 +5231,7 @@
                 <w:b/>
                 <w:bCs/>
               </w:rPr>
-              <w:t xml:space="preserve">COMO: administrador</w:t>
+              <w:t xml:space="preserve">COMO: Administrador</w:t>
             </w:r>
           </w:p>
           <w:p>
@@ -5257,7 +5257,7 @@
                 <w:b/>
                 <w:bCs/>
               </w:rPr>
-              <w:t xml:space="preserve">PARA: ter o catálogo completo, com foto, notas e acordes, sem cadastro manual.</w:t>
+              <w:t xml:space="preserve">PARA: ter a importação automática do catálogo, com foto, notas e acordes, sem cadastro manual.</w:t>
             </w:r>
           </w:p>
         </w:tc>
@@ -5413,7 +5413,7 @@
                 <w:b/>
                 <w:bCs/>
               </w:rPr>
-              <w:t xml:space="preserve">DADO QUE: um perfume já existe no catálogo</w:t>
+              <w:t xml:space="preserve">DADO QUE: a API está fora do ar ou recusa a chave de acesso</w:t>
             </w:r>
           </w:p>
           <w:p>
@@ -5429,7 +5429,7 @@
                 <w:b/>
                 <w:bCs/>
               </w:rPr>
-              <w:t xml:space="preserve">QUANDO: a importação traz esse mesmo perfume</w:t>
+              <w:t xml:space="preserve">QUANDO: aciono "Importar catálogo"</w:t>
             </w:r>
           </w:p>
           <w:p>
@@ -5445,7 +5445,7 @@
                 <w:b/>
                 <w:bCs/>
               </w:rPr>
-              <w:t xml:space="preserve">ENTÃO: o sistema atualiza os dados usando o identificador da API, sem duplicar o perfume.</w:t>
+              <w:t xml:space="preserve">ENTÃO: o sistema mantém o catálogo atual e registra no log o status "falhou" com a mensagem de erro.</w:t>
             </w:r>
           </w:p>
         </w:tc>
@@ -5507,7 +5507,7 @@
                 <w:b/>
                 <w:bCs/>
               </w:rPr>
-              <w:t xml:space="preserve">DADO QUE: a API está fora do ar ou recusa a chave de acesso</w:t>
+              <w:t xml:space="preserve">DADO QUE: um perfume já existe no catálogo</w:t>
             </w:r>
           </w:p>
           <w:p>
@@ -5523,7 +5523,7 @@
                 <w:b/>
                 <w:bCs/>
               </w:rPr>
-              <w:t xml:space="preserve">QUANDO: aciono "Importar catálogo"</w:t>
+              <w:t xml:space="preserve">QUANDO: a importação traz esse mesmo perfume</w:t>
             </w:r>
           </w:p>
           <w:p>
@@ -5539,7 +5539,7 @@
                 <w:b/>
                 <w:bCs/>
               </w:rPr>
-              <w:t xml:space="preserve">ENTÃO: o sistema mantém o catálogo atual e registra no log o status "falhou" com a mensagem de erro.</w:t>
+              <w:t xml:space="preserve">ENTÃO: o sistema atualiza os dados usando o identificador da API, sem duplicar o perfume.</w:t>
             </w:r>
           </w:p>
         </w:tc>
@@ -5686,7 +5686,7 @@
             <w:r>
               <w:drawing>
                 <wp:inline xmlns:a="http://schemas.openxmlformats.org/drawingml/2006/main" xmlns:pic="http://schemas.openxmlformats.org/drawingml/2006/picture">
-                  <wp:extent cx="5184040" cy="4016844"/>
+                  <wp:extent cx="5184040" cy="3040027"/>
                   <wp:docPr id="219" name="Picture 219"/>
                   <wp:cNvGraphicFramePr>
                     <a:graphicFrameLocks noChangeAspect="1"/>
@@ -5707,7 +5707,7 @@
                         <pic:spPr>
                           <a:xfrm>
                             <a:off x="0" y="0"/>
-                            <a:ext cx="5184040" cy="4016844"/>
+                            <a:ext cx="5184040" cy="3040027"/>
                           </a:xfrm>
                           <a:prstGeom prst="rect"/>
                         </pic:spPr>
@@ -5736,7 +5736,7 @@
         </w:r>
       </w:fldSimple>
       <w:r>
-        <w:t xml:space="preserve"> – Diagrama de Entidade e Relacionamento (lógico) do Modular Perfumes. Fonte: os autores.</w:t>
+        <w:t xml:space="preserve"> – Diagrama de Entidade e Relacionamento (lógico) da 1ª Sprint do Modular Perfumes. Fonte: os autores.</w:t>
       </w:r>
       <w:bookmarkEnd w:id="16"/>
     </w:p>

</xml_diff>

<commit_message>
Link do quadro do Trello no Artefato 5 e no README
Co-Authored-By: Claude Opus 5 (1M context) <noreply@anthropic.com>
</commit_message>
<xml_diff>
--- a/entregas/especificacao/Modular_Perfumes_Especificacao_do_Projeto.docx
+++ b/entregas/especificacao/Modular_Perfumes_Especificacao_do_Projeto.docx
@@ -5586,10 +5586,21 @@
         </w:rPr>
       </w:pPr>
       <w:r>
-        <w:rPr>
-          <w:highlight w:val="yellow"/>
-        </w:rPr>
-        <w:t xml:space="preserve">LINK DO TRELLO – FERRAMENTA DE GESTÃO DO PROJETO: [COLAR O LINK DO QUADRO] — quadro com as listas Product Backlog, Sprint 1 Backlog, Em Desenvolvimento, Em Teste e Concluído.</w:t>
+        <w:rPr/>
+        <w:t xml:space="preserve">LINK DO TRELLO – FERRAMENTA DE GESTÃO DO PROJETO: </w:t>
+      </w:r>
+      <w:hyperlink r:id="rId29">
+        <w:r>
+          <w:rPr>
+            <w:color w:val="0563C1"/>
+            <w:u w:val="single"/>
+          </w:rPr>
+          <w:t>https://trello.com/b/6aa8142cf99507d054887fdb</w:t>
+        </w:r>
+      </w:hyperlink>
+      <w:r>
+        <w:rPr/>
+        <w:t xml:space="preserve"> — quadro com as listas Product Backlog, Sprint 1 Backlog, Em Desenvolvimento, Em Teste e Concluído.</w:t>
       </w:r>
     </w:p>
     <w:p>

</xml_diff>

<commit_message>
Corrige acentos, amplia o questionário e adiciona vitrine e consultor de IA
- Script SQL declara SET NAMES utf8mb4: o MySQL do Docker gravava os
  acentos com codificação dupla ("vocÃª"). Teste novo cobre o caso.
- Questionário com 11 perguntas (estilo, período, fixação, orçamento, o
  que o cliente não gosta); rótulos legíveis de perfil, nível e gênero.
- Visual clean com toque de tecnologia (Inter, cartões com borda fina,
  degradê violeta/ciano, topo escuro com grade).
- Vitrine pública: melhores do ano, clássicos por década, tabela com
  foto, filtros e ficha com pirâmide olfativa. perfume ganha avaliação,
  popularidade e concentração vindas da Fragella.
- Consultor de IA (Claude via Tool Runner) com ferramentas que leem o
  perfil e o catálogo e registram recomendações; tabelas no script da
  2ª Sprint. 26 testes, com a API da Anthropic simulada.

Co-Authored-By: Claude Opus 5 (1M context) <noreply@anthropic.com>
</commit_message>
<xml_diff>
--- a/entregas/especificacao/Modular_Perfumes_Especificacao_do_Projeto.docx
+++ b/entregas/especificacao/Modular_Perfumes_Especificacao_do_Projeto.docx
@@ -5697,7 +5697,7 @@
             <w:r>
               <w:drawing>
                 <wp:inline xmlns:a="http://schemas.openxmlformats.org/drawingml/2006/main" xmlns:pic="http://schemas.openxmlformats.org/drawingml/2006/picture">
-                  <wp:extent cx="5184040" cy="3040027"/>
+                  <wp:extent cx="5184040" cy="3153715"/>
                   <wp:docPr id="219" name="Picture 219"/>
                   <wp:cNvGraphicFramePr>
                     <a:graphicFrameLocks noChangeAspect="1"/>
@@ -5718,7 +5718,7 @@
                         <pic:spPr>
                           <a:xfrm>
                             <a:off x="0" y="0"/>
-                            <a:ext cx="5184040" cy="3040027"/>
+                            <a:ext cx="5184040" cy="3153715"/>
                           </a:xfrm>
                           <a:prstGeom prst="rect"/>
                         </pic:spPr>

</xml_diff>